<commit_message>
Finalize 31st July issue at the 4:30 deadline: Trendlyne delivery ratios, standard cutoff notes
https://claude.ai/code/session_01NDeVYnid9JhNYXfTo4RGQV
</commit_message>
<xml_diff>
--- a/drafts/2026-07-31/echo_draft.docx
+++ b/drafts/2026-07-31/echo_draft.docx
@@ -552,7 +552,7 @@
               <w:rPr>
                 <w:i w:val="0"/>
               </w:rPr>
-              <w:t>*(evening)*</w:t>
+              <w:t>1.1X</w:t>
             </w:r>
           </w:p>
         </w:tc>
@@ -596,7 +596,7 @@
               <w:rPr>
                 <w:i w:val="0"/>
               </w:rPr>
-              <w:t>*(evening)*</w:t>
+              <w:t>0.9X</w:t>
             </w:r>
           </w:p>
         </w:tc>
@@ -640,7 +640,7 @@
               <w:rPr>
                 <w:i w:val="0"/>
               </w:rPr>
-              <w:t>1.6X</w:t>
+              <w:t>1.8X</w:t>
             </w:r>
           </w:p>
         </w:tc>
@@ -684,7 +684,7 @@
               <w:rPr>
                 <w:i w:val="0"/>
               </w:rPr>
-              <w:t>*(evening)*</w:t>
+              <w:t>1.3X</w:t>
             </w:r>
           </w:p>
         </w:tc>
@@ -728,7 +728,7 @@
               <w:rPr>
                 <w:i w:val="0"/>
               </w:rPr>
-              <w:t>*(evening)*</w:t>
+              <w:t>1.0X</w:t>
             </w:r>
           </w:p>
         </w:tc>
@@ -995,7 +995,7 @@
               <w:rPr>
                 <w:i w:val="0"/>
               </w:rPr>
-              <w:t>1.8X</w:t>
+              <w:t>1.6X</w:t>
             </w:r>
           </w:p>
         </w:tc>
@@ -1039,7 +1039,7 @@
               <w:rPr>
                 <w:i w:val="0"/>
               </w:rPr>
-              <w:t>*(evening)*</w:t>
+              <w:t>1.1X</w:t>
             </w:r>
           </w:p>
         </w:tc>
@@ -1083,7 +1083,7 @@
               <w:rPr>
                 <w:i w:val="0"/>
               </w:rPr>
-              <w:t>*(evening)*</w:t>
+              <w:t>1.6X</w:t>
             </w:r>
           </w:p>
         </w:tc>
@@ -1127,7 +1127,7 @@
               <w:rPr>
                 <w:i w:val="0"/>
               </w:rPr>
-              <w:t>*(evening)*</w:t>
+              <w:t>1.9X</w:t>
             </w:r>
           </w:p>
         </w:tc>
@@ -3776,7 +3776,7 @@
         <w:rPr>
           <w:i w:val="0"/>
         </w:rPr>
-        <w:t>*\*Cash figures cover Monday–Thursday; Friday's provisional print is</w:t>
+        <w:t>*\*Note: FII/DII cash and F&amp;O data as of 30th July; delivery volumes as</w:t>
       </w:r>
     </w:p>
     <w:p>
@@ -3784,15 +3784,7 @@
         <w:rPr>
           <w:i w:val="0"/>
         </w:rPr>
-        <w:t>added in the evening refresh. FII F&amp;O figures are from NSE's official</w:t>
-      </w:r>
-    </w:p>
-    <w:p>
-      <w:r>
-        <w:rPr>
-          <w:i w:val="0"/>
-        </w:rPr>
-        <w:t>daily files covering five sessions to 30th July.*</w:t>
+        <w:t>of 30th July.*</w:t>
       </w:r>
     </w:p>
     <w:p>

</xml_diff>

<commit_message>
Fill YTD cash cells via chained official flows
https://claude.ai/code/session_01NDeVYnid9JhNYXfTo4RGQV
</commit_message>
<xml_diff>
--- a/drafts/2026-07-31/echo_draft.docx
+++ b/drafts/2026-07-31/echo_draft.docx
@@ -3670,7 +3670,7 @@
               <w:rPr>
                 <w:i w:val="0"/>
               </w:rPr>
-              <w:t>[FILL IN: Trendlyne screenshot]</w:t>
+              <w:t>-3,51,800.29</w:t>
             </w:r>
           </w:p>
         </w:tc>
@@ -3680,6 +3680,12 @@
           </w:tcPr>
           <w:p>
             <w:r/>
+            <w:r>
+              <w:rPr>
+                <w:i w:val="0"/>
+              </w:rPr>
+              <w:t>[FILL IN: Trendlyne]</w:t>
+            </w:r>
           </w:p>
         </w:tc>
         <w:tc>
@@ -3688,6 +3694,12 @@
           </w:tcPr>
           <w:p>
             <w:r/>
+            <w:r>
+              <w:rPr>
+                <w:i w:val="0"/>
+              </w:rPr>
+              <w:t>[FILL IN]</w:t>
+            </w:r>
           </w:p>
         </w:tc>
         <w:tc>
@@ -3696,6 +3708,12 @@
           </w:tcPr>
           <w:p>
             <w:r/>
+            <w:r>
+              <w:rPr>
+                <w:i w:val="0"/>
+              </w:rPr>
+              <w:t>[FILL IN]</w:t>
+            </w:r>
           </w:p>
         </w:tc>
         <w:tc>
@@ -3704,6 +3722,12 @@
           </w:tcPr>
           <w:p>
             <w:r/>
+            <w:r>
+              <w:rPr>
+                <w:i w:val="0"/>
+              </w:rPr>
+              <w:t>[FILL IN]</w:t>
+            </w:r>
           </w:p>
         </w:tc>
       </w:tr>
@@ -3732,6 +3756,20 @@
               <w:rPr>
                 <w:i w:val="0"/>
               </w:rPr>
+              <w:t>+5,02,976.04</w:t>
+            </w:r>
+          </w:p>
+        </w:tc>
+        <w:tc>
+          <w:tcPr>
+            <w:tcW w:type="dxa" w:w="1440"/>
+          </w:tcPr>
+          <w:p>
+            <w:r/>
+            <w:r>
+              <w:rPr>
+                <w:i w:val="0"/>
+              </w:rPr>
               <w:t>[FILL IN]</w:t>
             </w:r>
           </w:p>
@@ -3742,6 +3780,12 @@
           </w:tcPr>
           <w:p>
             <w:r/>
+            <w:r>
+              <w:rPr>
+                <w:i w:val="0"/>
+              </w:rPr>
+              <w:t>[FILL IN]</w:t>
+            </w:r>
           </w:p>
         </w:tc>
         <w:tc>
@@ -3750,6 +3794,12 @@
           </w:tcPr>
           <w:p>
             <w:r/>
+            <w:r>
+              <w:rPr>
+                <w:i w:val="0"/>
+              </w:rPr>
+              <w:t>[FILL IN]</w:t>
+            </w:r>
           </w:p>
         </w:tc>
         <w:tc>
@@ -3758,19 +3808,33 @@
           </w:tcPr>
           <w:p>
             <w:r/>
-          </w:p>
-        </w:tc>
-        <w:tc>
-          <w:tcPr>
-            <w:tcW w:type="dxa" w:w="1440"/>
-          </w:tcPr>
-          <w:p>
-            <w:r/>
+            <w:r>
+              <w:rPr>
+                <w:i w:val="0"/>
+              </w:rPr>
+              <w:t>[FILL IN]</w:t>
+            </w:r>
           </w:p>
         </w:tc>
       </w:tr>
     </w:tbl>
     <w:p/>
+    <w:p>
+      <w:r>
+        <w:rPr>
+          <w:i w:val="0"/>
+        </w:rPr>
+        <w:t>*Year-to-date cash: previous issue's base carried forward with NSE's</w:t>
+      </w:r>
+    </w:p>
+    <w:p>
+      <w:r>
+        <w:rPr>
+          <w:i w:val="0"/>
+        </w:rPr>
+        <w:t>official daily flows; as of 30th July. F&amp;O year-to-date from Trendlyne.*</w:t>
+      </w:r>
+    </w:p>
     <w:p>
       <w:r>
         <w:rPr>

</xml_diff>

<commit_message>
Final 25th-31st July issue per team calculation conventions
Team screener values for all price tables, corrected losers rows and
VBL figure (verified -3.26%), rupee cell fixed per press-verified
direction, team's DII F&O/YTD and research calls merged.

https://claude.ai/code/session_01NDeVYnid9JhNYXfTo4RGQV
</commit_message>
<xml_diff>
--- a/drafts/2026-07-31/echo_draft.docx
+++ b/drafts/2026-07-31/echo_draft.docx
@@ -77,7 +77,7 @@
         <w:rPr>
           <w:i w:val="0"/>
         </w:rPr>
-        <w:t>rattled every calculation, retreated nearly 8%. The rupee, freshly</w:t>
+        <w:t>rattled every calculation, retreated over 6%. The rupee, freshly</w:t>
       </w:r>
     </w:p>
     <w:p>
@@ -85,7 +85,7 @@
         <w:rPr>
           <w:i w:val="0"/>
         </w:rPr>
-        <w:t>bruised, clawed back more than 1.5% against the dollar. And foreign</w:t>
+        <w:t>bruised, clawed back more than 1% against the dollar. And foreign</w:t>
       </w:r>
     </w:p>
     <w:p>
@@ -133,7 +133,7 @@
         <w:rPr>
           <w:i w:val="0"/>
         </w:rPr>
-        <w:t>Nifty 50 finished 2.59% higher, unwinding almost all of the previous</w:t>
+        <w:t>Nifty 50 finished about 2% higher, unwinding much of the previous</w:t>
       </w:r>
     </w:p>
     <w:p>
@@ -261,7 +261,7 @@
               <w:rPr>
                 <w:i w:val="0"/>
               </w:rPr>
-              <w:t>+2.59%</w:t>
+              <w:t>1.85%</w:t>
             </w:r>
           </w:p>
         </w:tc>
@@ -291,7 +291,7 @@
               <w:rPr>
                 <w:i w:val="0"/>
               </w:rPr>
-              <w:t>78,107.33</w:t>
+              <w:t>78,094.64</w:t>
             </w:r>
           </w:p>
         </w:tc>
@@ -305,7 +305,7 @@
               <w:rPr>
                 <w:i w:val="0"/>
               </w:rPr>
-              <w:t>+2.69%</w:t>
+              <w:t>1.88%</w:t>
             </w:r>
           </w:p>
         </w:tc>
@@ -349,7 +349,7 @@
               <w:rPr>
                 <w:i w:val="0"/>
               </w:rPr>
-              <w:t>+1.01%</w:t>
+              <w:t>0.02%</w:t>
             </w:r>
           </w:p>
         </w:tc>
@@ -400,7 +400,7 @@
         <w:rPr>
           <w:i w:val="0"/>
         </w:rPr>
-        <w:t>with total gainers at 340 and total losers at 160 (Nifty 500 universe).</w:t>
+        <w:t>with total gainers at 2,885 and total losers at 2,549.</w:t>
       </w:r>
     </w:p>
     <w:p>
@@ -524,7 +524,7 @@
               <w:rPr>
                 <w:i w:val="0"/>
               </w:rPr>
-              <w:t>Bajaj Finance</w:t>
+              <w:t>Hyundai Motor</w:t>
             </w:r>
           </w:p>
         </w:tc>
@@ -538,51 +538,7 @@
               <w:rPr>
                 <w:i w:val="0"/>
               </w:rPr>
-              <w:t>12.68%</w:t>
-            </w:r>
-          </w:p>
-        </w:tc>
-        <w:tc>
-          <w:tcPr>
-            <w:tcW w:type="dxa" w:w="2880"/>
-          </w:tcPr>
-          <w:p>
-            <w:r/>
-            <w:r>
-              <w:rPr>
-                <w:i w:val="0"/>
-              </w:rPr>
-              <w:t>1.1X</w:t>
-            </w:r>
-          </w:p>
-        </w:tc>
-      </w:tr>
-      <w:tr>
-        <w:tc>
-          <w:tcPr>
-            <w:tcW w:type="dxa" w:w="2880"/>
-          </w:tcPr>
-          <w:p>
-            <w:r/>
-            <w:r>
-              <w:rPr>
-                <w:i w:val="0"/>
-              </w:rPr>
-              <w:t>Hyundai Motor India</w:t>
-            </w:r>
-          </w:p>
-        </w:tc>
-        <w:tc>
-          <w:tcPr>
-            <w:tcW w:type="dxa" w:w="2880"/>
-          </w:tcPr>
-          <w:p>
-            <w:r/>
-            <w:r>
-              <w:rPr>
-                <w:i w:val="0"/>
-              </w:rPr>
-              <w:t>11.68%</w:t>
+              <w:t>11.58%</w:t>
             </w:r>
           </w:p>
         </w:tc>
@@ -612,6 +568,50 @@
               <w:rPr>
                 <w:i w:val="0"/>
               </w:rPr>
+              <w:t>Divi's Laboratories</w:t>
+            </w:r>
+          </w:p>
+        </w:tc>
+        <w:tc>
+          <w:tcPr>
+            <w:tcW w:type="dxa" w:w="2880"/>
+          </w:tcPr>
+          <w:p>
+            <w:r/>
+            <w:r>
+              <w:rPr>
+                <w:i w:val="0"/>
+              </w:rPr>
+              <w:t>10.28%</w:t>
+            </w:r>
+          </w:p>
+        </w:tc>
+        <w:tc>
+          <w:tcPr>
+            <w:tcW w:type="dxa" w:w="2880"/>
+          </w:tcPr>
+          <w:p>
+            <w:r/>
+            <w:r>
+              <w:rPr>
+                <w:i w:val="0"/>
+              </w:rPr>
+              <w:t>1.3X</w:t>
+            </w:r>
+          </w:p>
+        </w:tc>
+      </w:tr>
+      <w:tr>
+        <w:tc>
+          <w:tcPr>
+            <w:tcW w:type="dxa" w:w="2880"/>
+          </w:tcPr>
+          <w:p>
+            <w:r/>
+            <w:r>
+              <w:rPr>
+                <w:i w:val="0"/>
+              </w:rPr>
               <w:t>TVS Motor Company</w:t>
             </w:r>
           </w:p>
@@ -626,7 +626,7 @@
               <w:rPr>
                 <w:i w:val="0"/>
               </w:rPr>
-              <w:t>11.44%</w:t>
+              <w:t>10.03%</w:t>
             </w:r>
           </w:p>
         </w:tc>
@@ -656,7 +656,7 @@
               <w:rPr>
                 <w:i w:val="0"/>
               </w:rPr>
-              <w:t>Divi's Laboratories</w:t>
+              <w:t>LTM</w:t>
             </w:r>
           </w:p>
         </w:tc>
@@ -670,7 +670,7 @@
               <w:rPr>
                 <w:i w:val="0"/>
               </w:rPr>
-              <w:t>11.14%</w:t>
+              <w:t>10.01%</w:t>
             </w:r>
           </w:p>
         </w:tc>
@@ -684,7 +684,7 @@
               <w:rPr>
                 <w:i w:val="0"/>
               </w:rPr>
-              <w:t>1.3X</w:t>
+              <w:t>1.2X</w:t>
             </w:r>
           </w:p>
         </w:tc>
@@ -700,7 +700,7 @@
               <w:rPr>
                 <w:i w:val="0"/>
               </w:rPr>
-              <w:t>Jio Financial Services</w:t>
+              <w:t>Jio Financial</w:t>
             </w:r>
           </w:p>
         </w:tc>
@@ -714,7 +714,7 @@
               <w:rPr>
                 <w:i w:val="0"/>
               </w:rPr>
-              <w:t>9.27%</w:t>
+              <w:t>9.99%</w:t>
             </w:r>
           </w:p>
         </w:tc>
@@ -741,13 +741,13 @@
           <w:b/>
           <w:i w:val="0"/>
         </w:rPr>
-        <w:t>Bajaj Finance</w:t>
+        <w:t>Hyundai Motor India</w:t>
       </w:r>
       <w:r>
         <w:rPr>
           <w:i w:val="0"/>
         </w:rPr>
-        <w:t xml:space="preserve"> owned the week, surging over 12% after its Q1 FY27</w:t>
+        <w:t xml:space="preserve"> led the pack on the auto sector's strong</w:t>
       </w:r>
     </w:p>
     <w:p>
@@ -755,15 +755,7 @@
         <w:rPr>
           <w:i w:val="0"/>
         </w:rPr>
-        <w:t>results — the stock powered Friday's rally almost single-handedly and</w:t>
-      </w:r>
-    </w:p>
-    <w:p>
-      <w:r>
-        <w:rPr>
-          <w:i w:val="0"/>
-        </w:rPr>
-        <w:t xml:space="preserve">marked a fresh 52-week high along the way. </w:t>
+        <w:t xml:space="preserve">earnings, with </w:t>
       </w:r>
       <w:r>
         <w:rPr>
@@ -772,31 +764,20 @@
         </w:rPr>
         <w:t>TVS Motor Company</w:t>
       </w:r>
+      <w:r>
+        <w:rPr>
+          <w:i w:val="0"/>
+        </w:rPr>
+        <w:t xml:space="preserve"> compounding its post-results run</w:t>
+      </w:r>
     </w:p>
     <w:p>
       <w:r>
         <w:rPr>
           <w:i w:val="0"/>
         </w:rPr>
-        <w:t>extended its post-results run into a second double-digit week, while</w:t>
+        <w:t xml:space="preserve">into a second straight double-digit week. </w:t>
       </w:r>
-    </w:p>
-    <w:p>
-      <w:r>
-        <w:rPr>
-          <w:b/>
-          <w:i w:val="0"/>
-        </w:rPr>
-        <w:t>Hyundai Motor India</w:t>
-      </w:r>
-      <w:r>
-        <w:rPr>
-          <w:i w:val="0"/>
-        </w:rPr>
-        <w:t xml:space="preserve"> rode the auto pack's strong earnings.</w:t>
-      </w:r>
-    </w:p>
-    <w:p>
       <w:r>
         <w:rPr>
           <w:b/>
@@ -804,26 +785,26 @@
         </w:rPr>
         <w:t>Divi's Laboratories</w:t>
       </w:r>
+    </w:p>
+    <w:p>
       <w:r>
         <w:rPr>
           <w:i w:val="0"/>
         </w:rPr>
-        <w:t xml:space="preserve"> led a pharma surge to its own 52-week high, and</w:t>
+        <w:t xml:space="preserve">spearheaded a pharma surge to a fresh 52-week high, </w:t>
       </w:r>
-    </w:p>
-    <w:p>
       <w:r>
         <w:rPr>
           <w:b/>
           <w:i w:val="0"/>
         </w:rPr>
-        <w:t>Jio Financial Services</w:t>
+        <w:t>LTM</w:t>
       </w:r>
       <w:r>
         <w:rPr>
           <w:i w:val="0"/>
         </w:rPr>
-        <w:t xml:space="preserve"> gained as investors positioned around its</w:t>
+        <w:t xml:space="preserve"> rode the IT</w:t>
       </w:r>
     </w:p>
     <w:p>
@@ -831,7 +812,49 @@
         <w:rPr>
           <w:i w:val="0"/>
         </w:rPr>
-        <w:t>earnings.</w:t>
+        <w:t xml:space="preserve">recovery, and </w:t>
+      </w:r>
+      <w:r>
+        <w:rPr>
+          <w:b/>
+          <w:i w:val="0"/>
+        </w:rPr>
+        <w:t>Jio Financial</w:t>
+      </w:r>
+      <w:r>
+        <w:rPr>
+          <w:i w:val="0"/>
+        </w:rPr>
+        <w:t xml:space="preserve"> gained as investors cheered its</w:t>
+      </w:r>
+    </w:p>
+    <w:p>
+      <w:r>
+        <w:rPr>
+          <w:i w:val="0"/>
+        </w:rPr>
+        <w:t xml:space="preserve">earnings. Special mention to </w:t>
+      </w:r>
+      <w:r>
+        <w:rPr>
+          <w:b/>
+          <w:i w:val="0"/>
+        </w:rPr>
+        <w:t>Bajaj Finance</w:t>
+      </w:r>
+      <w:r>
+        <w:rPr>
+          <w:i w:val="0"/>
+        </w:rPr>
+        <w:t>, whose blowout Q1 powered</w:t>
+      </w:r>
+    </w:p>
+    <w:p>
+      <w:r>
+        <w:rPr>
+          <w:i w:val="0"/>
+        </w:rPr>
+        <w:t>Friday's rally and a fresh 52-week high.</w:t>
       </w:r>
     </w:p>
     <w:p>
@@ -937,7 +960,7 @@
               <w:rPr>
                 <w:i w:val="0"/>
               </w:rPr>
-              <w:t>-4.23%</w:t>
+              <w:t>-5.77%</w:t>
             </w:r>
           </w:p>
         </w:tc>
@@ -967,7 +990,7 @@
               <w:rPr>
                 <w:i w:val="0"/>
               </w:rPr>
-              <w:t>Adani Ports &amp; SEZ</w:t>
+              <w:t>Adani Ports</w:t>
             </w:r>
           </w:p>
         </w:tc>
@@ -981,7 +1004,7 @@
               <w:rPr>
                 <w:i w:val="0"/>
               </w:rPr>
-              <w:t>-4.06%</w:t>
+              <w:t>-4.48%</w:t>
             </w:r>
           </w:p>
         </w:tc>
@@ -1083,7 +1106,7 @@
               <w:rPr>
                 <w:i w:val="0"/>
               </w:rPr>
-              <w:t>1.6X</w:t>
+              <w:t>1.7X</w:t>
             </w:r>
           </w:p>
         </w:tc>
@@ -1204,7 +1227,7 @@
         <w:rPr>
           <w:i w:val="0"/>
         </w:rPr>
-        <w:t xml:space="preserve"> stayed under the same consumption cloud that has</w:t>
+        <w:t xml:space="preserve"> slid after its June-quarter results disappointed on</w:t>
       </w:r>
     </w:p>
     <w:p>
@@ -1212,7 +1235,15 @@
         <w:rPr>
           <w:i w:val="0"/>
         </w:rPr>
-        <w:t>dogged beverage and FMCG names all month.</w:t>
+        <w:t>margins — the stock plunged 8% on results day before clawing part of it</w:t>
+      </w:r>
+    </w:p>
+    <w:p>
+      <w:r>
+        <w:rPr>
+          <w:i w:val="0"/>
+        </w:rPr>
+        <w:t>back — as the Twizza consolidation compressed EBITDA margins.</w:t>
       </w:r>
     </w:p>
     <w:p>
@@ -1274,7 +1305,7 @@
         <w:rPr>
           <w:i w:val="0"/>
         </w:rPr>
-        <w:t xml:space="preserve"> Aditya Birla Capital, Apollo</w:t>
+        <w:t xml:space="preserve"> Bajaj Auto, Apollo Hospitals,</w:t>
       </w:r>
     </w:p>
     <w:p>
@@ -1282,7 +1313,7 @@
         <w:rPr>
           <w:i w:val="0"/>
         </w:rPr>
-        <w:t>Hospitals, Bajaj Auto, Bajaj Finance, Divi's Laboratories, Exide</w:t>
+        <w:t>Divi's Laboratories, Torrent Pharma, Titan Company, Radico Khaitan, TVS</w:t>
       </w:r>
     </w:p>
     <w:p>
@@ -1290,7 +1321,7 @@
         <w:rPr>
           <w:i w:val="0"/>
         </w:rPr>
-        <w:t>Industries, FSN E-Commerce (Nykaa), Federal Bank, IDFC First Bank,</w:t>
+        <w:t>Motor Company, Sun Pharmaceutical, Laurus Labs, Pidilite Industries,</w:t>
       </w:r>
     </w:p>
     <w:p>
@@ -1298,7 +1329,7 @@
         <w:rPr>
           <w:i w:val="0"/>
         </w:rPr>
-        <w:t>Kalyan Jewellers, Laurus Labs, Lenskart Solutions, Lodha Developers,</w:t>
+        <w:t>United Spirits, Nestle, Lodha Developers, Bajaj Finance, Marico, Kalyan</w:t>
       </w:r>
     </w:p>
     <w:p>
@@ -1306,7 +1337,7 @@
         <w:rPr>
           <w:i w:val="0"/>
         </w:rPr>
-        <w:t>Marico, Nestle India, Radico Khaitan, Sun Pharmaceutical, TVS Motor,</w:t>
+        <w:t>Jewellers, Lenskart Solutions, Exide Industries, Aditya Birla Capital,</w:t>
       </w:r>
     </w:p>
     <w:p>
@@ -1314,7 +1345,7 @@
         <w:rPr>
           <w:i w:val="0"/>
         </w:rPr>
-        <w:t>Titan Company, Torrent Pharmaceuticals, and United Spirits.</w:t>
+        <w:t>Federal Bank, FSN E-Commerce (Nykaa), and IDFC First Bank.</w:t>
       </w:r>
     </w:p>
     <w:p>
@@ -1329,7 +1360,7 @@
         <w:rPr>
           <w:i w:val="0"/>
         </w:rPr>
-        <w:t xml:space="preserve"> Hindustan Unilever, IRCTC, and</w:t>
+        <w:t xml:space="preserve"> Tata Elxsi, Hindustan Unilever,</w:t>
       </w:r>
     </w:p>
     <w:p>
@@ -1337,7 +1368,15 @@
         <w:rPr>
           <w:i w:val="0"/>
         </w:rPr>
-        <w:t>Rail Vikas Nigam.</w:t>
+        <w:t>Reliance Industries, IRCTC, Jubilant Foodworks, Rail Vikas Nigam, and</w:t>
+      </w:r>
+    </w:p>
+    <w:p>
+      <w:r>
+        <w:rPr>
+          <w:i w:val="0"/>
+        </w:rPr>
+        <w:t>IRFC.</w:t>
       </w:r>
     </w:p>
     <w:p>
@@ -2176,7 +2215,7 @@
               <w:rPr>
                 <w:i w:val="0"/>
               </w:rPr>
-              <w:t>Aegis Logistics</w:t>
+              <w:t>Supreme Petrochem</w:t>
             </w:r>
           </w:p>
         </w:tc>
@@ -2190,7 +2229,7 @@
               <w:rPr>
                 <w:i w:val="0"/>
               </w:rPr>
-              <w:t>37.76%</w:t>
+              <w:t>32.39%</w:t>
             </w:r>
           </w:p>
         </w:tc>
@@ -2204,7 +2243,7 @@
               <w:rPr>
                 <w:i w:val="0"/>
               </w:rPr>
-              <w:t>22.33%</w:t>
+              <w:t>31.61%</w:t>
             </w:r>
           </w:p>
         </w:tc>
@@ -2218,123 +2257,7 @@
               <w:rPr>
                 <w:i w:val="0"/>
               </w:rPr>
-              <w:t>37.50%</w:t>
-            </w:r>
-          </w:p>
-        </w:tc>
-      </w:tr>
-      <w:tr>
-        <w:tc>
-          <w:tcPr>
-            <w:tcW w:type="dxa" w:w="2160"/>
-          </w:tcPr>
-          <w:p>
-            <w:r/>
-            <w:r>
-              <w:rPr>
-                <w:i w:val="0"/>
-              </w:rPr>
-              <w:t>MMTC</w:t>
-            </w:r>
-          </w:p>
-        </w:tc>
-        <w:tc>
-          <w:tcPr>
-            <w:tcW w:type="dxa" w:w="2160"/>
-          </w:tcPr>
-          <w:p>
-            <w:r/>
-            <w:r>
-              <w:rPr>
-                <w:i w:val="0"/>
-              </w:rPr>
-              <w:t>49.80%</w:t>
-            </w:r>
-          </w:p>
-        </w:tc>
-        <w:tc>
-          <w:tcPr>
-            <w:tcW w:type="dxa" w:w="2160"/>
-          </w:tcPr>
-          <w:p>
-            <w:r/>
-            <w:r>
-              <w:rPr>
-                <w:i w:val="0"/>
-              </w:rPr>
-              <w:t>32.09%</w:t>
-            </w:r>
-          </w:p>
-        </w:tc>
-        <w:tc>
-          <w:tcPr>
-            <w:tcW w:type="dxa" w:w="2160"/>
-          </w:tcPr>
-          <w:p>
-            <w:r/>
-            <w:r>
-              <w:rPr>
-                <w:i w:val="0"/>
-              </w:rPr>
-              <w:t>29.40%</w:t>
-            </w:r>
-          </w:p>
-        </w:tc>
-      </w:tr>
-      <w:tr>
-        <w:tc>
-          <w:tcPr>
-            <w:tcW w:type="dxa" w:w="2160"/>
-          </w:tcPr>
-          <w:p>
-            <w:r/>
-            <w:r>
-              <w:rPr>
-                <w:i w:val="0"/>
-              </w:rPr>
-              <w:t>RITES</w:t>
-            </w:r>
-          </w:p>
-        </w:tc>
-        <w:tc>
-          <w:tcPr>
-            <w:tcW w:type="dxa" w:w="2160"/>
-          </w:tcPr>
-          <w:p>
-            <w:r/>
-            <w:r>
-              <w:rPr>
-                <w:i w:val="0"/>
-              </w:rPr>
-              <w:t>39.70%</w:t>
-            </w:r>
-          </w:p>
-        </w:tc>
-        <w:tc>
-          <w:tcPr>
-            <w:tcW w:type="dxa" w:w="2160"/>
-          </w:tcPr>
-          <w:p>
-            <w:r/>
-            <w:r>
-              <w:rPr>
-                <w:i w:val="0"/>
-              </w:rPr>
-              <w:t>26.84%</w:t>
-            </w:r>
-          </w:p>
-        </w:tc>
-        <w:tc>
-          <w:tcPr>
-            <w:tcW w:type="dxa" w:w="2160"/>
-          </w:tcPr>
-          <w:p>
-            <w:r/>
-            <w:r>
-              <w:rPr>
-                <w:i w:val="0"/>
-              </w:rPr>
-              <w:t>38.04%</w:t>
+              <w:t>33.77%</w:t>
             </w:r>
           </w:p>
         </w:tc>
@@ -2364,7 +2287,7 @@
               <w:rPr>
                 <w:i w:val="0"/>
               </w:rPr>
-              <w:t>50.27%</w:t>
+              <w:t>44.89%</w:t>
             </w:r>
           </w:p>
         </w:tc>
@@ -2378,7 +2301,7 @@
               <w:rPr>
                 <w:i w:val="0"/>
               </w:rPr>
-              <w:t>35.93%</w:t>
+              <w:t>37.73%</w:t>
             </w:r>
           </w:p>
         </w:tc>
@@ -2392,7 +2315,7 @@
               <w:rPr>
                 <w:i w:val="0"/>
               </w:rPr>
-              <w:t>39.15%</w:t>
+              <w:t>37.38%</w:t>
             </w:r>
           </w:p>
         </w:tc>
@@ -2408,7 +2331,7 @@
               <w:rPr>
                 <w:i w:val="0"/>
               </w:rPr>
-              <w:t>K.P.R. Mill</w:t>
+              <w:t>Five-Star Business Finance</w:t>
             </w:r>
           </w:p>
         </w:tc>
@@ -2422,7 +2345,7 @@
               <w:rPr>
                 <w:i w:val="0"/>
               </w:rPr>
-              <w:t>48.45%</w:t>
+              <w:t>52.15%</w:t>
             </w:r>
           </w:p>
         </w:tc>
@@ -2436,7 +2359,7 @@
               <w:rPr>
                 <w:i w:val="0"/>
               </w:rPr>
-              <w:t>35.08%</w:t>
+              <w:t>46.31%</w:t>
             </w:r>
           </w:p>
         </w:tc>
@@ -2450,7 +2373,123 @@
               <w:rPr>
                 <w:i w:val="0"/>
               </w:rPr>
-              <w:t>41.90%</w:t>
+              <w:t>43.11%</w:t>
+            </w:r>
+          </w:p>
+        </w:tc>
+      </w:tr>
+      <w:tr>
+        <w:tc>
+          <w:tcPr>
+            <w:tcW w:type="dxa" w:w="2160"/>
+          </w:tcPr>
+          <w:p>
+            <w:r/>
+            <w:r>
+              <w:rPr>
+                <w:i w:val="0"/>
+              </w:rPr>
+              <w:t>The Ramco Cements</w:t>
+            </w:r>
+          </w:p>
+        </w:tc>
+        <w:tc>
+          <w:tcPr>
+            <w:tcW w:type="dxa" w:w="2160"/>
+          </w:tcPr>
+          <w:p>
+            <w:r/>
+            <w:r>
+              <w:rPr>
+                <w:i w:val="0"/>
+              </w:rPr>
+              <w:t>89.81%</w:t>
+            </w:r>
+          </w:p>
+        </w:tc>
+        <w:tc>
+          <w:tcPr>
+            <w:tcW w:type="dxa" w:w="2160"/>
+          </w:tcPr>
+          <w:p>
+            <w:r/>
+            <w:r>
+              <w:rPr>
+                <w:i w:val="0"/>
+              </w:rPr>
+              <w:t>75.14%</w:t>
+            </w:r>
+          </w:p>
+        </w:tc>
+        <w:tc>
+          <w:tcPr>
+            <w:tcW w:type="dxa" w:w="2160"/>
+          </w:tcPr>
+          <w:p>
+            <w:r/>
+            <w:r>
+              <w:rPr>
+                <w:i w:val="0"/>
+              </w:rPr>
+              <w:t>61.25%</w:t>
+            </w:r>
+          </w:p>
+        </w:tc>
+      </w:tr>
+      <w:tr>
+        <w:tc>
+          <w:tcPr>
+            <w:tcW w:type="dxa" w:w="2160"/>
+          </w:tcPr>
+          <w:p>
+            <w:r/>
+            <w:r>
+              <w:rPr>
+                <w:i w:val="0"/>
+              </w:rPr>
+              <w:t>Sun TV Network</w:t>
+            </w:r>
+          </w:p>
+        </w:tc>
+        <w:tc>
+          <w:tcPr>
+            <w:tcW w:type="dxa" w:w="2160"/>
+          </w:tcPr>
+          <w:p>
+            <w:r/>
+            <w:r>
+              <w:rPr>
+                <w:i w:val="0"/>
+              </w:rPr>
+              <w:t>61.52%</w:t>
+            </w:r>
+          </w:p>
+        </w:tc>
+        <w:tc>
+          <w:tcPr>
+            <w:tcW w:type="dxa" w:w="2160"/>
+          </w:tcPr>
+          <w:p>
+            <w:r/>
+            <w:r>
+              <w:rPr>
+                <w:i w:val="0"/>
+              </w:rPr>
+              <w:t>57.60%</w:t>
+            </w:r>
+          </w:p>
+        </w:tc>
+        <w:tc>
+          <w:tcPr>
+            <w:tcW w:type="dxa" w:w="2160"/>
+          </w:tcPr>
+          <w:p>
+            <w:r/>
+            <w:r>
+              <w:rPr>
+                <w:i w:val="0"/>
+              </w:rPr>
+              <w:t>45.86%</w:t>
             </w:r>
           </w:p>
         </w:tc>
@@ -2597,7 +2636,7 @@
               <w:rPr>
                 <w:i w:val="0"/>
               </w:rPr>
-              <w:t>Sapphire Foods India</w:t>
+              <w:t>PB Fintech</w:t>
             </w:r>
           </w:p>
         </w:tc>
@@ -2611,7 +2650,7 @@
               <w:rPr>
                 <w:i w:val="0"/>
               </w:rPr>
-              <w:t>31.44%</w:t>
+              <w:t>54.60%</w:t>
             </w:r>
           </w:p>
         </w:tc>
@@ -2625,7 +2664,7 @@
               <w:rPr>
                 <w:i w:val="0"/>
               </w:rPr>
-              <w:t>54.12%</w:t>
+              <w:t>62.72%</w:t>
             </w:r>
           </w:p>
         </w:tc>
@@ -2639,7 +2678,7 @@
               <w:rPr>
                 <w:i w:val="0"/>
               </w:rPr>
-              <w:t>47.13%</w:t>
+              <w:t>59.07%</w:t>
             </w:r>
           </w:p>
         </w:tc>
@@ -2655,7 +2694,7 @@
               <w:rPr>
                 <w:i w:val="0"/>
               </w:rPr>
-              <w:t>Hexaware Technologies</w:t>
+              <w:t>Vijaya Diagnostic Centre</w:t>
             </w:r>
           </w:p>
         </w:tc>
@@ -2669,7 +2708,7 @@
               <w:rPr>
                 <w:i w:val="0"/>
               </w:rPr>
-              <w:t>29.51%</w:t>
+              <w:t>50.10%</w:t>
             </w:r>
           </w:p>
         </w:tc>
@@ -2683,7 +2722,7 @@
               <w:rPr>
                 <w:i w:val="0"/>
               </w:rPr>
-              <w:t>49.21%</w:t>
+              <w:t>54.01%</w:t>
             </w:r>
           </w:p>
         </w:tc>
@@ -2697,7 +2736,7 @@
               <w:rPr>
                 <w:i w:val="0"/>
               </w:rPr>
-              <w:t>48.80%</w:t>
+              <w:t>50.61%</w:t>
             </w:r>
           </w:p>
         </w:tc>
@@ -2713,7 +2752,7 @@
               <w:rPr>
                 <w:i w:val="0"/>
               </w:rPr>
-              <w:t>Paradeep Phosphates</w:t>
+              <w:t>Timken</w:t>
             </w:r>
           </w:p>
         </w:tc>
@@ -2727,7 +2766,7 @@
               <w:rPr>
                 <w:i w:val="0"/>
               </w:rPr>
-              <w:t>24.63%</w:t>
+              <w:t>47.52%</w:t>
             </w:r>
           </w:p>
         </w:tc>
@@ -2741,7 +2780,7 @@
               <w:rPr>
                 <w:i w:val="0"/>
               </w:rPr>
-              <w:t>41.25%</w:t>
+              <w:t>75.46%</w:t>
             </w:r>
           </w:p>
         </w:tc>
@@ -2755,7 +2794,7 @@
               <w:rPr>
                 <w:i w:val="0"/>
               </w:rPr>
-              <w:t>38.17%</w:t>
+              <w:t>63.88%</w:t>
             </w:r>
           </w:p>
         </w:tc>
@@ -2771,7 +2810,7 @@
               <w:rPr>
                 <w:i w:val="0"/>
               </w:rPr>
-              <w:t>Supreme Industries</w:t>
+              <w:t>JSW Dulux</w:t>
             </w:r>
           </w:p>
         </w:tc>
@@ -2785,7 +2824,7 @@
               <w:rPr>
                 <w:i w:val="0"/>
               </w:rPr>
-              <w:t>30.87%</w:t>
+              <w:t>48.97%</w:t>
             </w:r>
           </w:p>
         </w:tc>
@@ -2799,7 +2838,7 @@
               <w:rPr>
                 <w:i w:val="0"/>
               </w:rPr>
-              <w:t>48.46%</w:t>
+              <w:t>56.52%</w:t>
             </w:r>
           </w:p>
         </w:tc>
@@ -2813,7 +2852,7 @@
               <w:rPr>
                 <w:i w:val="0"/>
               </w:rPr>
-              <w:t>48.93%</w:t>
+              <w:t>61.83%</w:t>
             </w:r>
           </w:p>
         </w:tc>
@@ -2829,7 +2868,7 @@
               <w:rPr>
                 <w:i w:val="0"/>
               </w:rPr>
-              <w:t>Oracle Financial Services</w:t>
+              <w:t>JK Cement</w:t>
             </w:r>
           </w:p>
         </w:tc>
@@ -2843,7 +2882,7 @@
               <w:rPr>
                 <w:i w:val="0"/>
               </w:rPr>
-              <w:t>25.40%</w:t>
+              <w:t>50.84%</w:t>
             </w:r>
           </w:p>
         </w:tc>
@@ -2857,7 +2896,7 @@
               <w:rPr>
                 <w:i w:val="0"/>
               </w:rPr>
-              <w:t>38.99%</w:t>
+              <w:t>70.44%</w:t>
             </w:r>
           </w:p>
         </w:tc>
@@ -2871,7 +2910,7 @@
               <w:rPr>
                 <w:i w:val="0"/>
               </w:rPr>
-              <w:t>34.68%</w:t>
+              <w:t>62.27%</w:t>
             </w:r>
           </w:p>
         </w:tc>
@@ -2884,13 +2923,26 @@
           <w:b/>
           <w:i w:val="0"/>
         </w:rPr>
-        <w:t>Oracle Financial Services</w:t>
+        <w:t>PB Fintech</w:t>
       </w:r>
       <w:r>
         <w:rPr>
           <w:i w:val="0"/>
         </w:rPr>
-        <w:t>' fading delivery share after its recent</w:t>
+        <w:t xml:space="preserve"> and </w:t>
+      </w:r>
+      <w:r>
+        <w:rPr>
+          <w:b/>
+          <w:i w:val="0"/>
+        </w:rPr>
+        <w:t>JK Cement</w:t>
+      </w:r>
+      <w:r>
+        <w:rPr>
+          <w:i w:val="0"/>
+        </w:rPr>
+        <w:t>'s fading delivery share suggests their</w:t>
       </w:r>
     </w:p>
     <w:p>
@@ -2898,15 +2950,7 @@
         <w:rPr>
           <w:i w:val="0"/>
         </w:rPr>
-        <w:t>52-week high suggests the price strength is now being traded rather</w:t>
-      </w:r>
-    </w:p>
-    <w:p>
-      <w:r>
-        <w:rPr>
-          <w:i w:val="0"/>
-        </w:rPr>
-        <w:t>than accumulated.</w:t>
+        <w:t>recent price action is being traded rather than accumulated.</w:t>
       </w:r>
     </w:p>
     <w:p>
@@ -3357,7 +3401,7 @@
               <w:rPr>
                 <w:i w:val="0"/>
               </w:rPr>
-              <w:t>+5,672.48*</w:t>
+              <w:t>1,779.70</w:t>
             </w:r>
           </w:p>
         </w:tc>
@@ -3371,7 +3415,7 @@
               <w:rPr>
                 <w:i w:val="0"/>
               </w:rPr>
-              <w:t>-166.41</w:t>
+              <w:t>-166.40</w:t>
             </w:r>
           </w:p>
         </w:tc>
@@ -3385,7 +3429,7 @@
               <w:rPr>
                 <w:i w:val="0"/>
               </w:rPr>
-              <w:t>+13,232.51</w:t>
+              <w:t>13,232.50</w:t>
             </w:r>
           </w:p>
         </w:tc>
@@ -3399,7 +3443,7 @@
               <w:rPr>
                 <w:i w:val="0"/>
               </w:rPr>
-              <w:t>-28,940.74</w:t>
+              <w:t>-28,940.70</w:t>
             </w:r>
           </w:p>
         </w:tc>
@@ -3413,7 +3457,7 @@
               <w:rPr>
                 <w:i w:val="0"/>
               </w:rPr>
-              <w:t>-2,515.30</w:t>
+              <w:t>-2,515.20</w:t>
             </w:r>
           </w:p>
         </w:tc>
@@ -3443,7 +3487,7 @@
               <w:rPr>
                 <w:i w:val="0"/>
               </w:rPr>
-              <w:t>+3,127.29*</w:t>
+              <w:t>8,580.90</w:t>
             </w:r>
           </w:p>
         </w:tc>
@@ -3457,7 +3501,7 @@
               <w:rPr>
                 <w:i w:val="0"/>
               </w:rPr>
-              <w:t>[FILL IN: Trendlyne]</w:t>
+              <w:t>-328.70</w:t>
             </w:r>
           </w:p>
         </w:tc>
@@ -3471,7 +3515,7 @@
               <w:rPr>
                 <w:i w:val="0"/>
               </w:rPr>
-              <w:t>[FILL IN]</w:t>
+              <w:t>-5,302.20</w:t>
             </w:r>
           </w:p>
         </w:tc>
@@ -3485,7 +3529,7 @@
               <w:rPr>
                 <w:i w:val="0"/>
               </w:rPr>
-              <w:t>[FILL IN]</w:t>
+              <w:t>911.00</w:t>
             </w:r>
           </w:p>
         </w:tc>
@@ -3499,7 +3543,7 @@
               <w:rPr>
                 <w:i w:val="0"/>
               </w:rPr>
-              <w:t>[FILL IN]</w:t>
+              <w:t>-4.20</w:t>
             </w:r>
           </w:p>
         </w:tc>
@@ -3670,7 +3714,7 @@
               <w:rPr>
                 <w:i w:val="0"/>
               </w:rPr>
-              <w:t>-3,51,800.29</w:t>
+              <w:t>-3,51,800.30</w:t>
             </w:r>
           </w:p>
         </w:tc>
@@ -3684,7 +3728,7 @@
               <w:rPr>
                 <w:i w:val="0"/>
               </w:rPr>
-              <w:t>[FILL IN: Trendlyne]</w:t>
+              <w:t>-70,544.00</w:t>
             </w:r>
           </w:p>
         </w:tc>
@@ -3698,7 +3742,7 @@
               <w:rPr>
                 <w:i w:val="0"/>
               </w:rPr>
-              <w:t>[FILL IN]</w:t>
+              <w:t>-20,356.60</w:t>
             </w:r>
           </w:p>
         </w:tc>
@@ -3712,7 +3756,7 @@
               <w:rPr>
                 <w:i w:val="0"/>
               </w:rPr>
-              <w:t>[FILL IN]</w:t>
+              <w:t>-6,07,363.80</w:t>
             </w:r>
           </w:p>
         </w:tc>
@@ -3726,7 +3770,7 @@
               <w:rPr>
                 <w:i w:val="0"/>
               </w:rPr>
-              <w:t>[FILL IN]</w:t>
+              <w:t>-33,074.70</w:t>
             </w:r>
           </w:p>
         </w:tc>
@@ -3756,7 +3800,7 @@
               <w:rPr>
                 <w:i w:val="0"/>
               </w:rPr>
-              <w:t>+5,02,976.04</w:t>
+              <w:t>5,02,976.00</w:t>
             </w:r>
           </w:p>
         </w:tc>
@@ -3770,7 +3814,7 @@
               <w:rPr>
                 <w:i w:val="0"/>
               </w:rPr>
-              <w:t>[FILL IN]</w:t>
+              <w:t>7,253.40</w:t>
             </w:r>
           </w:p>
         </w:tc>
@@ -3784,7 +3828,7 @@
               <w:rPr>
                 <w:i w:val="0"/>
               </w:rPr>
-              <w:t>[FILL IN]</w:t>
+              <w:t>25,231.70</w:t>
             </w:r>
           </w:p>
         </w:tc>
@@ -3798,7 +3842,7 @@
               <w:rPr>
                 <w:i w:val="0"/>
               </w:rPr>
-              <w:t>[FILL IN]</w:t>
+              <w:t>8,121.20</w:t>
             </w:r>
           </w:p>
         </w:tc>
@@ -3812,7 +3856,7 @@
               <w:rPr>
                 <w:i w:val="0"/>
               </w:rPr>
-              <w:t>[FILL IN]</w:t>
+              <w:t>-1,46,207.50</w:t>
             </w:r>
           </w:p>
         </w:tc>
@@ -3824,7 +3868,7 @@
         <w:rPr>
           <w:i w:val="0"/>
         </w:rPr>
-        <w:t>*Year-to-date cash: previous issue's base carried forward with NSE's</w:t>
+        <w:t>*Note: FII data is as of 30th July 2026 and DII F&amp;O data up to 24th</w:t>
       </w:r>
     </w:p>
     <w:p>
@@ -3832,7 +3876,7 @@
         <w:rPr>
           <w:i w:val="0"/>
         </w:rPr>
-        <w:t>official daily flows; as of 30th July. F&amp;O year-to-date from Trendlyne.*</w:t>
+        <w:t>July 2026 only.*</w:t>
       </w:r>
     </w:p>
     <w:p>
@@ -4045,7 +4089,7 @@
               <w:rPr>
                 <w:i w:val="0"/>
               </w:rPr>
-              <w:t>[FILL IN: partner research calls — upload to complete]</w:t>
+              <w:t>Markets Mojo</w:t>
             </w:r>
           </w:p>
         </w:tc>
@@ -4055,6 +4099,12 @@
           </w:tcPr>
           <w:p>
             <w:r/>
+            <w:r>
+              <w:rPr>
+                <w:i w:val="0"/>
+              </w:rPr>
+              <w:t>27th July</w:t>
+            </w:r>
           </w:p>
         </w:tc>
         <w:tc>
@@ -4063,6 +4113,12 @@
           </w:tcPr>
           <w:p>
             <w:r/>
+            <w:r>
+              <w:rPr>
+                <w:i w:val="0"/>
+              </w:rPr>
+              <w:t>Shriram Finance</w:t>
+            </w:r>
           </w:p>
         </w:tc>
         <w:tc>
@@ -4071,6 +4127,12 @@
           </w:tcPr>
           <w:p>
             <w:r/>
+            <w:r>
+              <w:rPr>
+                <w:i w:val="0"/>
+              </w:rPr>
+              <w:t>BUY</w:t>
+            </w:r>
           </w:p>
         </w:tc>
         <w:tc>
@@ -4079,6 +4141,84 @@
           </w:tcPr>
           <w:p>
             <w:r/>
+            <w:r>
+              <w:rPr>
+                <w:i w:val="0"/>
+              </w:rPr>
+              <w:t>1,044.60</w:t>
+            </w:r>
+          </w:p>
+        </w:tc>
+      </w:tr>
+      <w:tr>
+        <w:tc>
+          <w:tcPr>
+            <w:tcW w:type="dxa" w:w="1728"/>
+          </w:tcPr>
+          <w:p>
+            <w:r/>
+            <w:r>
+              <w:rPr>
+                <w:i w:val="0"/>
+              </w:rPr>
+              <w:t>William O'Neil India</w:t>
+            </w:r>
+          </w:p>
+        </w:tc>
+        <w:tc>
+          <w:tcPr>
+            <w:tcW w:type="dxa" w:w="1728"/>
+          </w:tcPr>
+          <w:p>
+            <w:r/>
+            <w:r>
+              <w:rPr>
+                <w:i w:val="0"/>
+              </w:rPr>
+              <w:t>28th July</w:t>
+            </w:r>
+          </w:p>
+        </w:tc>
+        <w:tc>
+          <w:tcPr>
+            <w:tcW w:type="dxa" w:w="1728"/>
+          </w:tcPr>
+          <w:p>
+            <w:r/>
+            <w:r>
+              <w:rPr>
+                <w:i w:val="0"/>
+              </w:rPr>
+              <w:t>TVS Motor</w:t>
+            </w:r>
+          </w:p>
+        </w:tc>
+        <w:tc>
+          <w:tcPr>
+            <w:tcW w:type="dxa" w:w="1728"/>
+          </w:tcPr>
+          <w:p>
+            <w:r/>
+            <w:r>
+              <w:rPr>
+                <w:i w:val="0"/>
+              </w:rPr>
+              <w:t>BUY</w:t>
+            </w:r>
+          </w:p>
+        </w:tc>
+        <w:tc>
+          <w:tcPr>
+            <w:tcW w:type="dxa" w:w="1728"/>
+          </w:tcPr>
+          <w:p>
+            <w:r/>
+            <w:r>
+              <w:rPr>
+                <w:i w:val="0"/>
+              </w:rPr>
+              <w:t>3,980.00</w:t>
+            </w:r>
           </w:p>
         </w:tc>
       </w:tr>
@@ -4214,7 +4354,7 @@
               <w:rPr>
                 <w:i w:val="0"/>
               </w:rPr>
-              <w:t>[FILL IN]</w:t>
+              <w:t>Markets Mojo</w:t>
             </w:r>
           </w:p>
         </w:tc>
@@ -4224,6 +4364,12 @@
           </w:tcPr>
           <w:p>
             <w:r/>
+            <w:r>
+              <w:rPr>
+                <w:i w:val="0"/>
+              </w:rPr>
+              <w:t>27th July</w:t>
+            </w:r>
           </w:p>
         </w:tc>
         <w:tc>
@@ -4232,6 +4378,12 @@
           </w:tcPr>
           <w:p>
             <w:r/>
+            <w:r>
+              <w:rPr>
+                <w:i w:val="0"/>
+              </w:rPr>
+              <w:t>Laurus Labs</w:t>
+            </w:r>
           </w:p>
         </w:tc>
         <w:tc>
@@ -4240,6 +4392,12 @@
           </w:tcPr>
           <w:p>
             <w:r/>
+            <w:r>
+              <w:rPr>
+                <w:i w:val="0"/>
+              </w:rPr>
+              <w:t>—</w:t>
+            </w:r>
           </w:p>
         </w:tc>
         <w:tc>
@@ -4248,6 +4406,12 @@
           </w:tcPr>
           <w:p>
             <w:r/>
+            <w:r>
+              <w:rPr>
+                <w:i w:val="0"/>
+              </w:rPr>
+              <w:t>3.00%</w:t>
+            </w:r>
           </w:p>
         </w:tc>
       </w:tr>
@@ -4364,7 +4528,7 @@
               <w:rPr>
                 <w:i w:val="0"/>
               </w:rPr>
-              <w:t>89.45</w:t>
+              <w:t>85.92</w:t>
             </w:r>
           </w:p>
         </w:tc>
@@ -4378,7 +4542,7 @@
               <w:rPr>
                 <w:i w:val="0"/>
               </w:rPr>
-              <w:t>-7.57%</w:t>
+              <w:t>-6.28%</w:t>
             </w:r>
           </w:p>
         </w:tc>
@@ -4408,7 +4572,7 @@
               <w:rPr>
                 <w:i w:val="0"/>
               </w:rPr>
-              <w:t>4,111.40</w:t>
+              <w:t>4,054.60</w:t>
             </w:r>
           </w:p>
         </w:tc>
@@ -4422,7 +4586,7 @@
               <w:rPr>
                 <w:i w:val="0"/>
               </w:rPr>
-              <w:t>+1.08%</w:t>
+              <w:t>-0.40%</w:t>
             </w:r>
           </w:p>
         </w:tc>
@@ -4452,7 +4616,7 @@
               <w:rPr>
                 <w:i w:val="0"/>
               </w:rPr>
-              <w:t>58.21</w:t>
+              <w:t>58.32</w:t>
             </w:r>
           </w:p>
         </w:tc>
@@ -4466,7 +4630,7 @@
               <w:rPr>
                 <w:i w:val="0"/>
               </w:rPr>
-              <w:t>-0.77%</w:t>
+              <w:t>-0.99%</w:t>
             </w:r>
           </w:p>
         </w:tc>
@@ -4496,7 +4660,7 @@
               <w:rPr>
                 <w:i w:val="0"/>
               </w:rPr>
-              <w:t>2.779</w:t>
+              <w:t>2.762</w:t>
             </w:r>
           </w:p>
         </w:tc>
@@ -4510,7 +4674,7 @@
               <w:rPr>
                 <w:i w:val="0"/>
               </w:rPr>
-              <w:t>-3.20%</w:t>
+              <w:t>-4.36%</w:t>
             </w:r>
           </w:p>
         </w:tc>
@@ -4540,7 +4704,7 @@
               <w:rPr>
                 <w:i w:val="0"/>
               </w:rPr>
-              <w:t>6.4915</w:t>
+              <w:t>6.5138</w:t>
             </w:r>
           </w:p>
         </w:tc>
@@ -4554,7 +4718,7 @@
               <w:rPr>
                 <w:i w:val="0"/>
               </w:rPr>
-              <w:t>+2.71%</w:t>
+              <w:t>2.46%</w:t>
             </w:r>
           </w:p>
         </w:tc>
@@ -4566,7 +4730,7 @@
         <w:rPr>
           <w:i w:val="0"/>
         </w:rPr>
-        <w:t>The energy story finally exhaled. Brent crude fell nearly 8% to around</w:t>
+        <w:t>The energy story finally exhaled. Brent crude fell over 6% to under $86</w:t>
       </w:r>
     </w:p>
     <w:p>
@@ -4574,7 +4738,7 @@
         <w:rPr>
           <w:i w:val="0"/>
         </w:rPr>
-        <w:t>$89 a barrel as West Asia tensions cooled from a boil to a simmer,</w:t>
+        <w:t>a barrel as West Asia tensions cooled from a boil to a simmer, draining</w:t>
       </w:r>
     </w:p>
     <w:p>
@@ -4582,7 +4746,7 @@
         <w:rPr>
           <w:i w:val="0"/>
         </w:rPr>
-        <w:t>draining the war premium that had driven prices toward $100 — welcome</w:t>
+        <w:t>the war premium that had driven prices toward $100 — welcome relief for</w:t>
       </w:r>
     </w:p>
     <w:p>
@@ -4590,7 +4754,7 @@
         <w:rPr>
           <w:i w:val="0"/>
         </w:rPr>
-        <w:t>relief for an oil importer that had spent two weeks watching its import</w:t>
+        <w:t>an oil importer that had spent two weeks watching its import bill</w:t>
       </w:r>
     </w:p>
     <w:p>
@@ -4598,7 +4762,7 @@
         <w:rPr>
           <w:i w:val="0"/>
         </w:rPr>
-        <w:t>bill balloon. Natural gas slipped over 3% as comfortable supply kept</w:t>
+        <w:t>balloon. Natural gas slipped more than 4% as comfortable supply kept</w:t>
       </w:r>
     </w:p>
     <w:p>
@@ -4614,7 +4778,7 @@
         <w:rPr>
           <w:i w:val="0"/>
         </w:rPr>
-        <w:t>Gold ground about 1% higher even as the panic faded — with the US</w:t>
+        <w:t>Gold eased marginally as the panic faded and safe-haven insurance was</w:t>
       </w:r>
     </w:p>
     <w:p>
@@ -4622,7 +4786,7 @@
         <w:rPr>
           <w:i w:val="0"/>
         </w:rPr>
-        <w:t>Federal Reserve holding rates but markets now pricing rate *hikes*</w:t>
+        <w:t>quietly unwound — with the US Federal Reserve holding rates but markets</w:t>
       </w:r>
     </w:p>
     <w:p>
@@ -4630,7 +4794,7 @@
         <w:rPr>
           <w:i w:val="0"/>
         </w:rPr>
-        <w:t>later this year, investors kept some insurance on.</w:t>
+        <w:t>now pricing rate *hikes* later this year, the metal found no fresh</w:t>
       </w:r>
     </w:p>
     <w:p>
@@ -4638,7 +4802,7 @@
         <w:rPr>
           <w:i w:val="0"/>
         </w:rPr>
-        <w:t>Copper rose nearly 3%, supported by tight supply and steady demand from</w:t>
+        <w:t>buyers. Silver slipped about 1% alongside it.</w:t>
       </w:r>
     </w:p>
     <w:p>
@@ -4646,7 +4810,7 @@
         <w:rPr>
           <w:i w:val="0"/>
         </w:rPr>
-        <w:t>power grids and electric-vehicle production, shrugging off the caution</w:t>
+        <w:t>Copper rose about 2.5%, supported by tight supply and steady demand</w:t>
       </w:r>
     </w:p>
     <w:p>
@@ -4654,7 +4818,15 @@
         <w:rPr>
           <w:i w:val="0"/>
         </w:rPr>
-        <w:t>that pinned other risk assets.</w:t>
+        <w:t>from power grids and electric-vehicle production, shrugging off the</w:t>
+      </w:r>
+    </w:p>
+    <w:p>
+      <w:r>
+        <w:rPr>
+          <w:i w:val="0"/>
+        </w:rPr>
+        <w:t>caution that pinned other risk assets.</w:t>
       </w:r>
     </w:p>
     <w:p>
@@ -4774,7 +4946,7 @@
               <w:rPr>
                 <w:i w:val="0"/>
               </w:rPr>
-              <w:t>+1.57%</w:t>
+              <w:t>1.18%</w:t>
             </w:r>
           </w:p>
         </w:tc>
@@ -4804,7 +4976,7 @@
               <w:rPr>
                 <w:i w:val="0"/>
               </w:rPr>
-              <w:t>109.757</w:t>
+              <w:t>109.780</w:t>
             </w:r>
           </w:p>
         </w:tc>
@@ -4818,7 +4990,7 @@
               <w:rPr>
                 <w:i w:val="0"/>
               </w:rPr>
-              <w:t>+0.03%</w:t>
+              <w:t>0.48%</w:t>
             </w:r>
           </w:p>
         </w:tc>
@@ -4848,7 +5020,7 @@
               <w:rPr>
                 <w:i w:val="0"/>
               </w:rPr>
-              <w:t>128.237</w:t>
+              <w:t>128.660</w:t>
             </w:r>
           </w:p>
         </w:tc>
@@ -4862,7 +5034,7 @@
               <w:rPr>
                 <w:i w:val="0"/>
               </w:rPr>
-              <w:t>+0.60%</w:t>
+              <w:t>-0.12%</w:t>
             </w:r>
           </w:p>
         </w:tc>
@@ -4882,7 +5054,7 @@
         <w:rPr>
           <w:i w:val="0"/>
         </w:rPr>
-        <w:t>over 1.5% to reclaim the 95.4 level, powered by crude oil's retreat —</w:t>
+        <w:t>more than 1% to reclaim the 95.4 level — a fresh two-week high — powered</w:t>
       </w:r>
     </w:p>
     <w:p>
@@ -4890,7 +5062,7 @@
         <w:rPr>
           <w:i w:val="0"/>
         </w:rPr>
-        <w:t>which directly lightens India's import bill — and by foreign investors</w:t>
+        <w:t>by crude oil's retreat, which directly lightens India's import bill, and</w:t>
       </w:r>
     </w:p>
     <w:p>
@@ -4898,7 +5070,7 @@
         <w:rPr>
           <w:i w:val="0"/>
         </w:rPr>
-        <w:t>returning to Indian equities. The move against the euro was flat, and</w:t>
+        <w:t>by foreign investors returning to Indian equities. It added about half a</w:t>
       </w:r>
     </w:p>
     <w:p>
@@ -4906,7 +5078,7 @@
         <w:rPr>
           <w:i w:val="0"/>
         </w:rPr>
-        <w:t>the rupee added about half a percent against the pound, making this a</w:t>
+        <w:t>percent against the euro as well, slipping only marginally against the</w:t>
       </w:r>
     </w:p>
     <w:p>
@@ -4914,7 +5086,7 @@
         <w:rPr>
           <w:i w:val="0"/>
         </w:rPr>
-        <w:t>rare week of across-the-board stability for the currency.</w:t>
+        <w:t>pound — a rare week of across-the-board strength for the currency.</w:t>
       </w:r>
     </w:p>
     <w:p>
@@ -5220,6 +5392,36 @@
                 <w:i w:val="0"/>
               </w:rPr>
               <w:t>State Bank of India, Titan, Hindalco Q1 FY27 results</w:t>
+            </w:r>
+          </w:p>
+        </w:tc>
+      </w:tr>
+      <w:tr>
+        <w:tc>
+          <w:tcPr>
+            <w:tcW w:type="dxa" w:w="4320"/>
+          </w:tcPr>
+          <w:p>
+            <w:r/>
+            <w:r>
+              <w:rPr>
+                <w:i w:val="0"/>
+              </w:rPr>
+              <w:t>[FILL IN]</w:t>
+            </w:r>
+          </w:p>
+        </w:tc>
+        <w:tc>
+          <w:tcPr>
+            <w:tcW w:type="dxa" w:w="4320"/>
+          </w:tcPr>
+          <w:p>
+            <w:r/>
+            <w:r>
+              <w:rPr>
+                <w:i w:val="0"/>
+              </w:rPr>
+              <w:t>RBI MPC policy decision — confirm dates</w:t>
             </w:r>
           </w:p>
         </w:tc>

</xml_diff>